<commit_message>
Fix Word sample alignment for QA testing
</commit_message>
<xml_diff>
--- a/qa_downloads/LTLI_QA_sample_target.docx
+++ b/qa_downloads/LTLI_QA_sample_target.docx
@@ -22,7 +22,11 @@
         <w:t>계속하려면 {link}를 클릭하십시오.</w:t>
       </w:r>
     </w:p>
-    <w:p/>
+    <w:p>
+      <w:r>
+        <w:t>배송에는 영업일 기준 7일이 소요됩니다.</w:t>
+      </w:r>
+    </w:p>
     <w:p>
       <w:r>
         <w:t>사용자 안내서를 확인하십시오.</w:t>

</xml_diff>